<commit_message>
Explicita la contradicción del liofilizado de la muestra 4
El correo del 13/07 afirma que cada liofilizado contiene 10 µg de DOTAP y, a
la vez, que lo enviado equivale a 10 µg de liposomas. Con el DOTAP al 10 % de
los liposomas, ambas cosas no pueden ser: harían falta 100 µg de liposomas.

El documento dejaba implícita la base de cálculo. Ahora la explica y pide
confirmación, porque de esa cifra depende que la condición esté a 10:1 o a
1:1.

Co-Authored-By: Claude Opus 5 <noreply@anthropic.com>
Claude-Session: https://claude.ai/code/session_01NbLCpPtyUPtNBiPfSZ2z13
</commit_message>
<xml_diff>
--- a/protocolos/Informe_muestras_UCM_ensayo_03-08-2026.docx
+++ b/protocolos/Informe_muestras_UCM_ensayo_03-08-2026.docx
@@ -5940,7 +5940,7 @@
                 <w:sz w:val="19"/>
                 <w:szCs w:val="19"/>
               </w:rPr>
-              <w:t xml:space="preserve">A revisar: </w:t>
+              <w:t xml:space="preserve">Sobre el contenido del liofilizado: </w:t>
             </w:r>
             <w:r>
               <w:rPr>
@@ -5948,7 +5948,7 @@
                 <w:sz w:val="19"/>
                 <w:szCs w:val="19"/>
               </w:rPr>
-              <w:t xml:space="preserve">es posible que 10 µl fuera un volumen de resuspensión demasiado pequeño. Al repetir la condición nos interesa saber qué volumen recomendáis.</w:t>
+              <w:t xml:space="preserve">la descripción dice que cada liofilizado contiene 10 µg de DOTAP y, más abajo, que la cantidad enviada equivale a «10 µg de liposomas liofilizados». Ambas cosas no encajan: siendo el DOTAP el 10 % de los liposomas (1 mg/mL sobre 10 mg/mL), 10 µg de liposomas contendrían 1 µg de DOTAP, y para llegar a 10 µg harían falta 100 µg de liposomas. Hemos partido de que se liofilizaron 10 µl de liposomas —100 µg, con 10 µg de DOTAP—, que es lo que nos indicasteis y lo que hace cuadrar el ratio 10:1. Confirmadnos si no fuera así, porque de ello depende todo el cálculo de esta muestra. Al margen de esto, es posible que 10 µl fuera un volumen de resuspensión demasiado pequeño: al repetir la condición nos interesa saber qué volumen recomendáis.</w:t>
             </w:r>
           </w:p>
         </w:tc>

</xml_diff>